<commit_message>
Fix academic year bug
</commit_message>
<xml_diff>
--- a/backend/python/generator/templates/Teaching Dean's List 2024-25.docx
+++ b/backend/python/generator/templates/Teaching Dean's List 2024-25.docx
@@ -728,33 +728,21 @@
       </w:r>
       <w:r>
         <w:rPr>
-          <w:rFonts w:ascii="Arial" w:hAnsi="Arial" w:cs="Arial"/>
-        </w:rPr>
-        <w:t>20</w:t>
-      </w:r>
-      <w:r>
-        <w:rPr>
-          <w:rFonts w:ascii="Arial" w:hAnsi="Arial" w:cs="Arial"/>
-        </w:rPr>
-        <w:t>2</w:t>
-      </w:r>
-      <w:r>
-        <w:rPr>
-          <w:rFonts w:ascii="Arial" w:hAnsi="Arial" w:cs="Arial"/>
-        </w:rPr>
-        <w:t>4</w:t>
-      </w:r>
-      <w:r>
-        <w:rPr>
-          <w:rFonts w:ascii="Arial" w:hAnsi="Arial" w:cs="Arial"/>
-        </w:rPr>
-        <w:t>-202</w:t>
-      </w:r>
-      <w:r>
-        <w:rPr>
-          <w:rFonts w:ascii="Arial" w:hAnsi="Arial" w:cs="Arial"/>
-        </w:rPr>
-        <w:t>5</w:t>
+          <w:rFonts w:ascii="Bookman Old Style" w:hAnsi="Bookman Old Style"/>
+        </w:rPr>
+        <w:t>{{r ACADEMIC_YEAR_</w:t>
+      </w:r>
+      <w:r>
+        <w:rPr>
+          <w:rFonts w:ascii="Bookman Old Style" w:hAnsi="Bookman Old Style"/>
+        </w:rPr>
+        <w:t>FULL_PLAIN</w:t>
+      </w:r>
+      <w:r>
+        <w:rPr>
+          <w:rFonts w:ascii="Bookman Old Style" w:hAnsi="Bookman Old Style"/>
+        </w:rPr>
+        <w:t>}}</w:t>
       </w:r>
       <w:r>
         <w:rPr>

</xml_diff>